<commit_message>
UI: Final professional polish for PDF, DOCX, and TXT exports (Times font, centered headers, section fixes)
</commit_message>
<xml_diff>
--- a/data/generated_papers/Set_A_P-1773493710-A.docx
+++ b/data/generated_papers/Set_A_P-1773493710-A.docx
@@ -17,10 +17,21 @@
       </w:pPr>
       <w:r>
         <w:rPr>
-          <w:color w:val="64748B"/>
-          <w:sz w:val="20"/>
+          <w:b/>
+          <w:sz w:val="28"/>
         </w:rPr>
-        <w:t>Paper: Mid Term Examination - Set A  |  Duration: 3 Hours  |  Max Marks: 128  |  Date: 14-03-2026</w:t>
+        <w:t>Course: Data Structures (CS101)</w:t>
+      </w:r>
+    </w:p>
+    <w:p>
+      <w:pPr>
+        <w:jc w:val="center"/>
+      </w:pPr>
+      <w:r>
+        <w:rPr>
+          <w:sz w:val="22"/>
+        </w:rPr>
+        <w:t>Set: A  |  Time: 3 Hours  |  Max Marks: 128  |  Date: 14-03-2026</w:t>
       </w:r>
     </w:p>
     <w:p>
@@ -118,7 +129,7 @@
           <w:b/>
           <w:sz w:val="24"/>
         </w:rPr>
-        <w:t>SECTION A: MCQS</w:t>
+        <w:t>SECTION A: MCQs</w:t>
       </w:r>
     </w:p>
     <w:p>

</xml_diff>

<commit_message>
backup before account change
</commit_message>
<xml_diff>
--- a/data/generated_papers/Set_A_P-1773493710-A.docx
+++ b/data/generated_papers/Set_A_P-1773493710-A.docx
@@ -4,10 +4,13 @@
   <w:body>
     <w:p>
       <w:pPr>
-        <w:pStyle w:val="Title"/>
         <w:jc w:val="center"/>
       </w:pPr>
       <w:r>
+        <w:rPr>
+          <w:b/>
+          <w:sz w:val="44"/>
+        </w:rPr>
         <w:t>MID TERM EXAMINATION</w:t>
       </w:r>
     </w:p>
@@ -18,7 +21,7 @@
       <w:r>
         <w:rPr>
           <w:b/>
-          <w:sz w:val="28"/>
+          <w:sz w:val="32"/>
         </w:rPr>
         <w:t>Course: Data Structures (CS101)</w:t>
       </w:r>
@@ -31,24 +34,57 @@
         <w:rPr>
           <w:sz w:val="22"/>
         </w:rPr>
-        <w:t>Set: A  |  Time: 3 Hours  |  Max Marks: 128  |  Date: 14-03-2026</w:t>
+        <w:t>Set: A  |  Time: 3 Hours  |  Max Marks: 128  |  Date: 15-03-2026</w:t>
       </w:r>
     </w:p>
     <w:p>
+      <w:pPr>
+        <w:jc w:val="center"/>
+      </w:pPr>
       <w:r>
         <w:t>________________________________________________________________________________</w:t>
       </w:r>
     </w:p>
-    <w:p>
-      <w:r>
-        <w:rPr>
-          <w:i/>
-          <w:color w:val="64748B"/>
-          <w:sz w:val="18"/>
-        </w:rPr>
-        <w:t>Total Questions: 17  |  Answer all questions.</w:t>
-      </w:r>
-    </w:p>
+    <w:tbl>
+      <w:tblPr>
+        <w:tblStyle w:val="TableGrid"/>
+        <w:tblW w:type="auto" w:w="0"/>
+        <w:tblLook w:firstColumn="1" w:firstRow="1" w:lastColumn="0" w:lastRow="0" w:noHBand="0" w:noVBand="1" w:val="04A0"/>
+      </w:tblPr>
+      <w:tblGrid>
+        <w:gridCol w:w="8640"/>
+      </w:tblGrid>
+      <w:tr>
+        <w:tc>
+          <w:tcPr>
+            <w:tcW w:type="dxa" w:w="8640"/>
+          </w:tcPr>
+          <w:p>
+            <w:r>
+              <w:rPr>
+                <w:b/>
+                <w:sz w:val="20"/>
+              </w:rPr>
+              <w:t>GENERAL INSTRUCTIONS:</w:t>
+            </w:r>
+          </w:p>
+          <w:p>
+            <w:pPr>
+              <w:spacing w:before="80"/>
+            </w:pPr>
+            <w:r>
+              <w:rPr>
+                <w:sz w:val="20"/>
+              </w:rPr>
+              <w:t>1. Answer all questions.</w:t>
+              <w:br/>
+              <w:t>2. Figures to the right indicate full marks.</w:t>
+            </w:r>
+          </w:p>
+        </w:tc>
+      </w:tr>
+    </w:tbl>
+    <w:p/>
     <w:tbl>
       <w:tblPr>
         <w:tblW w:type="auto" w:w="0"/>
@@ -1272,6 +1308,10 @@
     <w:name w:val="Normal"/>
     <w:qFormat/>
     <w:rsid w:val="00FC693F"/>
+    <w:rPr>
+      <w:rFonts w:ascii="Times New Roman" w:hAnsi="Times New Roman"/>
+      <w:sz w:val="22"/>
+    </w:rPr>
   </w:style>
   <w:style w:type="paragraph" w:styleId="Header">
     <w:name w:val="header"/>

</xml_diff>